<commit_message>
fix: dark backgrounds should now honor light text in computed styles
</commit_message>
<xml_diff>
--- a/examples/product-launch-brief/output.docx
+++ b/examples/product-launch-brief/output.docx
@@ -48,6 +48,8 @@
                 <w:bCs w:val="false"/>
                 <w:i w:val="false"/>
                 <w:iCs w:val="false"/>
+                <w:caps/>
+                <w:color w:val="a8dadc"/>
                 <w:sz w:val="17"/>
                 <w:szCs w:val="17"/>
               </w:rPr>
@@ -67,6 +69,8 @@
                 <w:bCs/>
                 <w:i w:val="false"/>
                 <w:iCs w:val="false"/>
+                <w:caps w:val="false"/>
+                <w:color w:val="ffffff"/>
                 <w:sz w:val="48"/>
                 <w:szCs w:val="48"/>
               </w:rPr>
@@ -85,6 +89,8 @@
                 <w:bCs w:val="false"/>
                 <w:i w:val="false"/>
                 <w:iCs w:val="false"/>
+                <w:caps w:val="false"/>
+                <w:color w:val="cbd5e1"/>
                 <w:sz w:val="21"/>
                 <w:szCs w:val="21"/>
               </w:rPr>
@@ -151,6 +157,7 @@
                 <w:bCs/>
                 <w:i w:val="false"/>
                 <w:iCs w:val="false"/>
+                <w:caps w:val="false"/>
                 <w:color w:val="1d3557"/>
                 <w:sz w:val="21"/>
                 <w:szCs w:val="21"/>
@@ -163,6 +170,7 @@
                 <w:bCs w:val="false"/>
                 <w:i w:val="false"/>
                 <w:iCs w:val="false"/>
+                <w:caps w:val="false"/>
                 <w:color w:val="111111"/>
                 <w:sz w:val="21"/>
                 <w:szCs w:val="21"/>
@@ -175,6 +183,7 @@
                 <w:bCs w:val="false"/>
                 <w:i w:val="false"/>
                 <w:iCs w:val="false"/>
+                <w:caps w:val="false"/>
                 <w:color w:val="334155"/>
                 <w:sz w:val="21"/>
                 <w:szCs w:val="21"/>
@@ -197,6 +206,7 @@
           <w:bCs/>
           <w:i w:val="false"/>
           <w:iCs w:val="false"/>
+          <w:caps/>
           <w:color w:val="1d3557"/>
           <w:sz w:val="18"/>
           <w:szCs w:val="18"/>
@@ -209,6 +219,7 @@
           <w:bCs w:val="false"/>
           <w:i w:val="false"/>
           <w:iCs w:val="false"/>
+          <w:caps/>
           <w:color w:val="1d3557"/>
           <w:sz w:val="18"/>
           <w:szCs w:val="18"/>
@@ -221,6 +232,7 @@
           <w:bCs w:val="false"/>
           <w:i w:val="false"/>
           <w:iCs w:val="false"/>
+          <w:caps/>
           <w:color w:val="1d3557"/>
           <w:sz w:val="18"/>
           <w:szCs w:val="18"/>
@@ -268,6 +280,7 @@
                 <w:bCs/>
                 <w:i w:val="false"/>
                 <w:iCs w:val="false"/>
+                <w:caps w:val="false"/>
                 <w:color w:val="ffffff"/>
                 <w:sz w:val="21"/>
                 <w:szCs w:val="21"/>
@@ -298,6 +311,7 @@
                 <w:bCs/>
                 <w:i w:val="false"/>
                 <w:iCs w:val="false"/>
+                <w:caps w:val="false"/>
                 <w:color w:val="ffffff"/>
                 <w:sz w:val="21"/>
                 <w:szCs w:val="21"/>
@@ -330,6 +344,7 @@
                 <w:bCs w:val="false"/>
                 <w:i w:val="false"/>
                 <w:iCs w:val="false"/>
+                <w:caps w:val="false"/>
                 <w:color w:val="111111"/>
                 <w:sz w:val="21"/>
                 <w:szCs w:val="21"/>
@@ -360,6 +375,7 @@
                 <w:bCs w:val="false"/>
                 <w:i w:val="false"/>
                 <w:iCs w:val="false"/>
+                <w:caps w:val="false"/>
                 <w:color w:val="111111"/>
                 <w:sz w:val="21"/>
                 <w:szCs w:val="21"/>
@@ -392,6 +408,7 @@
                 <w:bCs w:val="false"/>
                 <w:i w:val="false"/>
                 <w:iCs w:val="false"/>
+                <w:caps w:val="false"/>
                 <w:color w:val="111111"/>
                 <w:sz w:val="21"/>
                 <w:szCs w:val="21"/>
@@ -422,6 +439,7 @@
                 <w:bCs w:val="false"/>
                 <w:i w:val="false"/>
                 <w:iCs w:val="false"/>
+                <w:caps w:val="false"/>
                 <w:color w:val="111111"/>
                 <w:sz w:val="21"/>
                 <w:szCs w:val="21"/>
@@ -454,6 +472,7 @@
                 <w:bCs w:val="false"/>
                 <w:i w:val="false"/>
                 <w:iCs w:val="false"/>
+                <w:caps w:val="false"/>
                 <w:color w:val="111111"/>
                 <w:sz w:val="21"/>
                 <w:szCs w:val="21"/>
@@ -484,6 +503,7 @@
                 <w:bCs w:val="false"/>
                 <w:i w:val="false"/>
                 <w:iCs w:val="false"/>
+                <w:caps w:val="false"/>
                 <w:color w:val="111111"/>
                 <w:sz w:val="21"/>
                 <w:szCs w:val="21"/>
@@ -507,6 +527,7 @@
           <w:bCs/>
           <w:i w:val="false"/>
           <w:iCs w:val="false"/>
+          <w:caps/>
           <w:color w:val="1d3557"/>
           <w:sz w:val="21"/>
           <w:szCs w:val="21"/>
@@ -555,6 +576,7 @@
                 <w:bCs/>
                 <w:i w:val="false"/>
                 <w:iCs w:val="false"/>
+                <w:caps w:val="false"/>
                 <w:color w:val="111111"/>
                 <w:sz w:val="21"/>
                 <w:szCs w:val="21"/>
@@ -585,6 +607,7 @@
                 <w:bCs/>
                 <w:i w:val="false"/>
                 <w:iCs w:val="false"/>
+                <w:caps w:val="false"/>
                 <w:color w:val="111111"/>
                 <w:sz w:val="21"/>
                 <w:szCs w:val="21"/>
@@ -615,6 +638,7 @@
                 <w:bCs/>
                 <w:i w:val="false"/>
                 <w:iCs w:val="false"/>
+                <w:caps w:val="false"/>
                 <w:color w:val="111111"/>
                 <w:sz w:val="21"/>
                 <w:szCs w:val="21"/>
@@ -646,6 +670,7 @@
                 <w:bCs w:val="false"/>
                 <w:i w:val="false"/>
                 <w:iCs w:val="false"/>
+                <w:caps w:val="false"/>
                 <w:color w:val="111111"/>
                 <w:sz w:val="21"/>
                 <w:szCs w:val="21"/>
@@ -675,6 +700,7 @@
                 <w:bCs w:val="false"/>
                 <w:i w:val="false"/>
                 <w:iCs w:val="false"/>
+                <w:caps w:val="false"/>
                 <w:color w:val="111111"/>
                 <w:sz w:val="21"/>
                 <w:szCs w:val="21"/>
@@ -704,6 +730,7 @@
                 <w:bCs w:val="false"/>
                 <w:i w:val="false"/>
                 <w:iCs w:val="false"/>
+                <w:caps w:val="false"/>
                 <w:color w:val="111111"/>
                 <w:sz w:val="21"/>
                 <w:szCs w:val="21"/>
@@ -735,6 +762,7 @@
                 <w:bCs w:val="false"/>
                 <w:i w:val="false"/>
                 <w:iCs w:val="false"/>
+                <w:caps w:val="false"/>
                 <w:color w:val="111111"/>
                 <w:sz w:val="21"/>
                 <w:szCs w:val="21"/>
@@ -764,6 +792,7 @@
                 <w:bCs w:val="false"/>
                 <w:i w:val="false"/>
                 <w:iCs w:val="false"/>
+                <w:caps w:val="false"/>
                 <w:color w:val="111111"/>
                 <w:sz w:val="21"/>
                 <w:szCs w:val="21"/>
@@ -793,6 +822,7 @@
                 <w:bCs w:val="false"/>
                 <w:i w:val="false"/>
                 <w:iCs w:val="false"/>
+                <w:caps w:val="false"/>
                 <w:color w:val="111111"/>
                 <w:sz w:val="21"/>
                 <w:szCs w:val="21"/>
@@ -824,6 +854,7 @@
                 <w:bCs w:val="false"/>
                 <w:i w:val="false"/>
                 <w:iCs w:val="false"/>
+                <w:caps w:val="false"/>
                 <w:color w:val="111111"/>
                 <w:sz w:val="21"/>
                 <w:szCs w:val="21"/>
@@ -853,6 +884,7 @@
                 <w:bCs w:val="false"/>
                 <w:i w:val="false"/>
                 <w:iCs w:val="false"/>
+                <w:caps w:val="false"/>
                 <w:color w:val="111111"/>
                 <w:sz w:val="21"/>
                 <w:szCs w:val="21"/>
@@ -882,6 +914,7 @@
                 <w:bCs w:val="false"/>
                 <w:i w:val="false"/>
                 <w:iCs w:val="false"/>
+                <w:caps w:val="false"/>
                 <w:color w:val="111111"/>
                 <w:sz w:val="21"/>
                 <w:szCs w:val="21"/>
@@ -914,6 +947,7 @@
                 <w:bCs/>
                 <w:i w:val="false"/>
                 <w:iCs w:val="false"/>
+                <w:caps w:val="false"/>
                 <w:color w:val="111111"/>
                 <w:sz w:val="21"/>
                 <w:szCs w:val="21"/>
@@ -944,6 +978,7 @@
                 <w:bCs/>
                 <w:i w:val="false"/>
                 <w:iCs w:val="false"/>
+                <w:caps w:val="false"/>
                 <w:color w:val="111111"/>
                 <w:sz w:val="21"/>
                 <w:szCs w:val="21"/>
@@ -974,6 +1009,7 @@
                 <w:bCs/>
                 <w:i w:val="false"/>
                 <w:iCs w:val="false"/>
+                <w:caps w:val="false"/>
                 <w:color w:val="111111"/>
                 <w:sz w:val="21"/>
                 <w:szCs w:val="21"/>
@@ -997,6 +1033,7 @@
           <w:bCs/>
           <w:i w:val="false"/>
           <w:iCs w:val="false"/>
+          <w:caps/>
           <w:color w:val="1d3557"/>
           <w:sz w:val="21"/>
           <w:szCs w:val="21"/>
@@ -1033,6 +1070,7 @@
           <w:bCs w:val="false"/>
           <w:i w:val="false"/>
           <w:iCs w:val="false"/>
+          <w:caps w:val="false"/>
           <w:color w:val="14532d"/>
           <w:sz w:val="17"/>
           <w:szCs w:val="17"/>
@@ -1046,6 +1084,7 @@
           <w:bCs w:val="false"/>
           <w:i w:val="false"/>
           <w:iCs w:val="false"/>
+          <w:caps w:val="false"/>
           <w:color w:val="44403c"/>
           <w:sz w:val="21"/>
           <w:szCs w:val="21"/>
@@ -1058,6 +1097,7 @@
           <w:bCs w:val="false"/>
           <w:i w:val="false"/>
           <w:iCs w:val="false"/>
+          <w:caps w:val="false"/>
           <w:color w:val="44403c"/>
           <w:sz w:val="21"/>
           <w:szCs w:val="21"/>
@@ -1082,6 +1122,7 @@
           <w:bCs w:val="false"/>
           <w:i w:val="false"/>
           <w:iCs w:val="false"/>
+          <w:caps w:val="false"/>
           <w:color w:val="92400e"/>
           <w:sz w:val="17"/>
           <w:szCs w:val="17"/>
@@ -1095,6 +1136,7 @@
           <w:bCs w:val="false"/>
           <w:i w:val="false"/>
           <w:iCs w:val="false"/>
+          <w:caps w:val="false"/>
           <w:color w:val="44403c"/>
           <w:sz w:val="21"/>
           <w:szCs w:val="21"/>
@@ -1107,6 +1149,7 @@
           <w:bCs w:val="false"/>
           <w:i w:val="false"/>
           <w:iCs w:val="false"/>
+          <w:caps w:val="false"/>
           <w:color w:val="44403c"/>
           <w:sz w:val="21"/>
           <w:szCs w:val="21"/>
@@ -1131,6 +1174,7 @@
           <w:bCs w:val="false"/>
           <w:i w:val="false"/>
           <w:iCs w:val="false"/>
+          <w:caps w:val="false"/>
           <w:color w:val="57534e"/>
           <w:sz w:val="17"/>
           <w:szCs w:val="17"/>
@@ -1144,6 +1188,7 @@
           <w:bCs w:val="false"/>
           <w:i w:val="false"/>
           <w:iCs w:val="false"/>
+          <w:caps w:val="false"/>
           <w:color w:val="44403c"/>
           <w:sz w:val="21"/>
           <w:szCs w:val="21"/>
@@ -1156,6 +1201,7 @@
           <w:bCs w:val="false"/>
           <w:i w:val="false"/>
           <w:iCs w:val="false"/>
+          <w:caps w:val="false"/>
           <w:color w:val="44403c"/>
           <w:sz w:val="21"/>
           <w:szCs w:val="21"/>
@@ -1187,6 +1233,7 @@
           <w:bCs w:val="false"/>
           <w:i w:val="false"/>
           <w:iCs w:val="false"/>
+          <w:caps w:val="false"/>
           <w:color w:val="1d3557"/>
           <w:sz w:val="20"/>
           <w:szCs w:val="20"/>
@@ -1199,6 +1246,7 @@
           <w:bCs/>
           <w:i w:val="false"/>
           <w:iCs w:val="false"/>
+          <w:caps w:val="false"/>
           <w:color w:val="1d3557"/>
           <w:sz w:val="20"/>
           <w:szCs w:val="20"/>
@@ -1211,6 +1259,7 @@
           <w:bCs w:val="false"/>
           <w:i w:val="false"/>
           <w:iCs w:val="false"/>
+          <w:caps w:val="false"/>
           <w:color w:val="1d3557"/>
           <w:sz w:val="20"/>
           <w:szCs w:val="20"/>
@@ -1223,6 +1272,7 @@
           <w:bCs w:val="false"/>
           <w:i w:val="false"/>
           <w:iCs w:val="false"/>
+          <w:caps w:val="false"/>
           <w:color w:val="1d3557"/>
           <w:sz w:val="20"/>
           <w:szCs w:val="20"/>
@@ -1235,13 +1285,14 @@
           <w:bCs w:val="false"/>
           <w:i w:val="false"/>
           <w:iCs w:val="false"/>
+          <w:caps w:val="false"/>
           <w:color w:val="1d3557"/>
           <w:sz w:val="20"/>
           <w:szCs w:val="20"/>
         </w:rPr>
         <w:t xml:space="preserve"> </w:t>
       </w:r>
-      <w:hyperlink w:history="1" r:id="rIdbhr_td_koym8i5vvnwtkf">
+      <w:hyperlink w:history="1" r:id="rId-egmtacqsym9bjqyqib5s">
         <w:r>
           <w:rPr>
             <w:rStyle w:val="Hyperlink"/>
@@ -1249,6 +1300,7 @@
             <w:bCs w:val="false"/>
             <w:i w:val="false"/>
             <w:iCs w:val="false"/>
+            <w:caps w:val="false"/>
             <w:color w:val="457b9d"/>
             <w:sz w:val="20"/>
             <w:szCs w:val="20"/>

</xml_diff>